<commit_message>
feat(handouts): add the decision step to the worksheet, the example, and the template
The decision step asks three questions: constraints, comparison, and
accountability. The blank worksheet gets a second page for them. The
worked example gets a stopping rule for its check, labels its decision,
and adds a non-use variant. The template and the clinic line use the
same three questions.

Co-Authored-By: Claude Opus 5.5 <noreply@anthropic.com>
</commit_message>
<xml_diff>
--- a/assets/handouts/use-statement-template.docx
+++ b/assets/handouts/use-statement-template.docx
@@ -498,7 +498,73 @@
         </w:numPr>
       </w:pPr>
       <w:r>
-        <w:t xml:space="preserve">What do you decide, and why? Under which conditions would you change the decision?</w:t>
+        <w:rPr>
+          <w:b/>
+          <w:bCs/>
+        </w:rPr>
+        <w:t xml:space="preserve">Constraints:</w:t>
+      </w:r>
+      <w:r>
+        <w:t xml:space="preserve"> </w:t>
+      </w:r>
+      <w:r>
+        <w:t xml:space="preserve">Which conditions must hold before you consider any use? Think of consent, data protection, and the rules that apply.</w:t>
+      </w:r>
+    </w:p>
+    <w:p>
+      <w:pPr>
+        <w:pStyle w:val="Compact"/>
+        <w:numPr>
+          <w:ilvl w:val="0"/>
+          <w:numId w:val="1007"/>
+        </w:numPr>
+      </w:pPr>
+      <w:r>
+        <w:rPr>
+          <w:b/>
+          <w:bCs/>
+        </w:rPr>
+        <w:t xml:space="preserve">Comparison:</w:t>
+      </w:r>
+      <w:r>
+        <w:t xml:space="preserve"> </w:t>
+      </w:r>
+      <w:r>
+        <w:t xml:space="preserve">How do benefits, burdens, and uncertainty compare with the alternative, for the same task and the same quality?</w:t>
+      </w:r>
+    </w:p>
+    <w:p>
+      <w:pPr>
+        <w:pStyle w:val="Compact"/>
+        <w:numPr>
+          <w:ilvl w:val="0"/>
+          <w:numId w:val="1007"/>
+        </w:numPr>
+      </w:pPr>
+      <w:r>
+        <w:rPr>
+          <w:b/>
+          <w:bCs/>
+        </w:rPr>
+        <w:t xml:space="preserve">Accountability:</w:t>
+      </w:r>
+      <w:r>
+        <w:t xml:space="preserve"> </w:t>
+      </w:r>
+      <w:r>
+        <w:t xml:space="preserve">Who decides, who can object, and when do you review the decision?</w:t>
+      </w:r>
+    </w:p>
+    <w:p>
+      <w:pPr>
+        <w:pStyle w:val="Compact"/>
+        <w:numPr>
+          <w:ilvl w:val="0"/>
+          <w:numId w:val="1007"/>
+        </w:numPr>
+      </w:pPr>
+      <w:r>
+        <w:t xml:space="preserve">What do you decide, and why? Which result would change the decision?</w:t>
       </w:r>
     </w:p>
     <w:bookmarkEnd w:id="18"/>

</xml_diff>

<commit_message>
docs(assessment): propose rubric criteria for evidence relevance and evaluation
The rubric keeps five criteria. Evidence must apply to the system and
the task. A mitigation must address the cause of a named risk. The
conclusion must name a check whose result would change the decision.
The rubric stays proposed until the instructors and GRACE approve it.

Co-Authored-By: Claude Opus 5.5 <noreply@anthropic.com>
</commit_message>
<xml_diff>
--- a/assets/handouts/use-statement-template.docx
+++ b/assets/handouts/use-statement-template.docx
@@ -664,13 +664,13 @@
           <w:b/>
           <w:bCs/>
         </w:rPr>
-        <w:t xml:space="preserve">At least two supported risks:</w:t>
+        <w:t xml:space="preserve">Relevant evidence:</w:t>
       </w:r>
       <w:r>
         <w:t xml:space="preserve"> </w:t>
       </w:r>
       <w:r>
-        <w:t xml:space="preserve">each risk has a source or evidence from the course.</w:t>
+        <w:t xml:space="preserve">at least two risks, each with a source or evidence from the course that applies to this system and task.</w:t>
       </w:r>
     </w:p>
     <w:p>
@@ -692,7 +692,7 @@
         <w:t xml:space="preserve"> </w:t>
       </w:r>
       <w:r>
-        <w:t xml:space="preserve">at least one mitigation or alternative that the author can carry out.</w:t>
+        <w:t xml:space="preserve">at least one mitigation or alternative that the author can carry out, and that addresses the cause of a named risk.</w:t>
       </w:r>
     </w:p>
     <w:p>
@@ -736,7 +736,7 @@
         <w:t xml:space="preserve"> </w:t>
       </w:r>
       <w:r>
-        <w:t xml:space="preserve">a decision that follows from the analysis and states its limits.</w:t>
+        <w:t xml:space="preserve">a decision that follows from the analysis, names a check whose result would change it, and states its limits.</w:t>
       </w:r>
     </w:p>
     <w:p>

</xml_diff>

<commit_message>
docs(assessment): check the form only and require a domain-expert peer
The instructors are not experts in each participant's field. They now check
the form of the Use Statement only: length, structure, sources, follow-up
action, peer note, and data protection. Each participant discusses the draft
with at least one domain-expert peer and adds a peer note without the peer's
name. The five former rubric criteria become questions for this discussion.

Rebuild the Use Statement template in Markdown, Word, and PDF.

Co-Authored-By: Claude Opus 5.5 <noreply@anthropic.com>
</commit_message>
<xml_diff>
--- a/assets/handouts/use-statement-template.docx
+++ b/assets/handouts/use-statement-template.docx
@@ -149,7 +149,7 @@
         <w:t xml:space="preserve"> </w:t>
       </w:r>
       <w:r>
-        <w:t xml:space="preserve">1,200 to 1,500 words, without the bibliography.</w:t>
+        <w:t xml:space="preserve">1,200 to 1,500 words, without the bibliography and the peer note.</w:t>
       </w:r>
       <w:r>
         <w:t xml:space="preserve"> </w:t>
@@ -175,13 +175,29 @@
           <w:b/>
           <w:bCs/>
         </w:rPr>
+        <w:t xml:space="preserve">Peer discussion:</w:t>
+      </w:r>
+      <w:r>
+        <w:t xml:space="preserve"> </w:t>
+      </w:r>
+      <w:r>
+        <w:t xml:space="preserve">discuss your draft with at least one peer who knows your field.</w:t>
+      </w:r>
+      <w:r>
+        <w:t xml:space="preserve"> </w:t>
+      </w:r>
+      <w:r>
+        <w:rPr>
+          <w:b/>
+          <w:bCs/>
+        </w:rPr>
         <w:t xml:space="preserve">Assessment:</w:t>
       </w:r>
       <w:r>
         <w:t xml:space="preserve"> </w:t>
       </w:r>
       <w:r>
-        <w:t xml:space="preserve">pass or fail, with the five criteria at the end.</w:t>
+        <w:t xml:space="preserve">a formal check, pass or fail, with the six criteria at the end.</w:t>
       </w:r>
     </w:p>
     <w:p>
@@ -612,13 +628,13 @@
       </w:r>
     </w:p>
     <w:bookmarkEnd w:id="20"/>
-    <w:bookmarkStart w:id="22" w:name="assessment-criteria-pass-or-fail"/>
+    <w:bookmarkStart w:id="21" w:name="peer-discussion"/>
     <w:p>
       <w:pPr>
         <w:pStyle w:val="Heading2"/>
       </w:pPr>
       <w:r>
-        <w:t xml:space="preserve">Assessment criteria (pass or fail)</w:t>
+        <w:t xml:space="preserve">Peer discussion</w:t>
       </w:r>
     </w:p>
     <w:p>
@@ -626,7 +642,7 @@
         <w:pStyle w:val="FirstParagraph"/>
       </w:pPr>
       <w:r>
-        <w:t xml:space="preserve">The statement passes when it meets all five criteria:</w:t>
+        <w:t xml:space="preserve">Discuss your draft with at least one peer who knows your field. Then revise it. Do not write the name of the peer.</w:t>
       </w:r>
     </w:p>
     <w:p>
@@ -635,6 +651,88 @@
         <w:numPr>
           <w:ilvl w:val="0"/>
           <w:numId w:val="1010"/>
+        </w:numPr>
+      </w:pPr>
+      <w:r>
+        <w:rPr>
+          <w:b/>
+          <w:bCs/>
+        </w:rPr>
+        <w:t xml:space="preserve">Field and role of the peer:</w:t>
+      </w:r>
+    </w:p>
+    <w:p>
+      <w:pPr>
+        <w:pStyle w:val="Compact"/>
+        <w:numPr>
+          <w:ilvl w:val="0"/>
+          <w:numId w:val="1010"/>
+        </w:numPr>
+      </w:pPr>
+      <w:r>
+        <w:rPr>
+          <w:b/>
+          <w:bCs/>
+        </w:rPr>
+        <w:t xml:space="preserve">Date of the discussion:</w:t>
+      </w:r>
+    </w:p>
+    <w:p>
+      <w:pPr>
+        <w:pStyle w:val="Compact"/>
+        <w:numPr>
+          <w:ilvl w:val="0"/>
+          <w:numId w:val="1010"/>
+        </w:numPr>
+      </w:pPr>
+      <w:r>
+        <w:rPr>
+          <w:b/>
+          <w:bCs/>
+        </w:rPr>
+        <w:t xml:space="preserve">Main feedback:</w:t>
+      </w:r>
+    </w:p>
+    <w:p>
+      <w:pPr>
+        <w:pStyle w:val="Compact"/>
+        <w:numPr>
+          <w:ilvl w:val="0"/>
+          <w:numId w:val="1010"/>
+        </w:numPr>
+      </w:pPr>
+      <w:r>
+        <w:rPr>
+          <w:b/>
+          <w:bCs/>
+        </w:rPr>
+        <w:t xml:space="preserve">What you changed:</w:t>
+      </w:r>
+    </w:p>
+    <w:bookmarkEnd w:id="21"/>
+    <w:bookmarkStart w:id="22" w:name="questions-for-your-peer"/>
+    <w:p>
+      <w:pPr>
+        <w:pStyle w:val="Heading2"/>
+      </w:pPr>
+      <w:r>
+        <w:t xml:space="preserve">Questions for your peer</w:t>
+      </w:r>
+    </w:p>
+    <w:p>
+      <w:pPr>
+        <w:pStyle w:val="FirstParagraph"/>
+      </w:pPr>
+      <w:r>
+        <w:t xml:space="preserve">These questions can guide the discussion. They are not graded. Ask your peer whether the statement:</w:t>
+      </w:r>
+    </w:p>
+    <w:p>
+      <w:pPr>
+        <w:pStyle w:val="Compact"/>
+        <w:numPr>
+          <w:ilvl w:val="0"/>
+          <w:numId w:val="1011"/>
         </w:numPr>
       </w:pPr>
       <w:r>
@@ -648,15 +746,15 @@
         <w:t xml:space="preserve"> </w:t>
       </w:r>
       <w:r>
-        <w:t xml:space="preserve">one concrete use or non-use, with the system and the task.</w:t>
-      </w:r>
-    </w:p>
-    <w:p>
-      <w:pPr>
-        <w:pStyle w:val="Compact"/>
-        <w:numPr>
-          <w:ilvl w:val="0"/>
-          <w:numId w:val="1010"/>
+        <w:t xml:space="preserve">describes one concrete use or non-use, with the system and the task.</w:t>
+      </w:r>
+    </w:p>
+    <w:p>
+      <w:pPr>
+        <w:pStyle w:val="Compact"/>
+        <w:numPr>
+          <w:ilvl w:val="0"/>
+          <w:numId w:val="1011"/>
         </w:numPr>
       </w:pPr>
       <w:r>
@@ -670,15 +768,15 @@
         <w:t xml:space="preserve"> </w:t>
       </w:r>
       <w:r>
-        <w:t xml:space="preserve">at least two risks, each with a source or evidence from the course that applies to this system and task.</w:t>
-      </w:r>
-    </w:p>
-    <w:p>
-      <w:pPr>
-        <w:pStyle w:val="Compact"/>
-        <w:numPr>
-          <w:ilvl w:val="0"/>
-          <w:numId w:val="1010"/>
+        <w:t xml:space="preserve">names at least two risks, each with a source or evidence from the course that applies to this system and task.</w:t>
+      </w:r>
+    </w:p>
+    <w:p>
+      <w:pPr>
+        <w:pStyle w:val="Compact"/>
+        <w:numPr>
+          <w:ilvl w:val="0"/>
+          <w:numId w:val="1011"/>
         </w:numPr>
       </w:pPr>
       <w:r>
@@ -692,15 +790,15 @@
         <w:t xml:space="preserve"> </w:t>
       </w:r>
       <w:r>
-        <w:t xml:space="preserve">at least one mitigation or alternative that the author can carry out, and that addresses the cause of a named risk.</w:t>
-      </w:r>
-    </w:p>
-    <w:p>
-      <w:pPr>
-        <w:pStyle w:val="Compact"/>
-        <w:numPr>
-          <w:ilvl w:val="0"/>
-          <w:numId w:val="1010"/>
+        <w:t xml:space="preserve">proposes at least one mitigation or alternative that the author can carry out, and that addresses the cause of a named risk.</w:t>
+      </w:r>
+    </w:p>
+    <w:p>
+      <w:pPr>
+        <w:pStyle w:val="Compact"/>
+        <w:numPr>
+          <w:ilvl w:val="0"/>
+          <w:numId w:val="1011"/>
         </w:numPr>
       </w:pPr>
       <w:r>
@@ -714,15 +812,15 @@
         <w:t xml:space="preserve"> </w:t>
       </w:r>
       <w:r>
-        <w:t xml:space="preserve">disclosure, citation, documentation, and the applicable rules.</w:t>
-      </w:r>
-    </w:p>
-    <w:p>
-      <w:pPr>
-        <w:pStyle w:val="Compact"/>
-        <w:numPr>
-          <w:ilvl w:val="0"/>
-          <w:numId w:val="1010"/>
+        <w:t xml:space="preserve">covers disclosure, citation, documentation, and the applicable rules.</w:t>
+      </w:r>
+    </w:p>
+    <w:p>
+      <w:pPr>
+        <w:pStyle w:val="Compact"/>
+        <w:numPr>
+          <w:ilvl w:val="0"/>
+          <w:numId w:val="1011"/>
         </w:numPr>
       </w:pPr>
       <w:r>
@@ -736,7 +834,157 @@
         <w:t xml:space="preserve"> </w:t>
       </w:r>
       <w:r>
-        <w:t xml:space="preserve">a decision that follows from the analysis, names a check whose result would change it, and states its limits.</w:t>
+        <w:t xml:space="preserve">reaches a decision that follows from the analysis, names a check whose result would change it, and states its limits.</w:t>
+      </w:r>
+    </w:p>
+    <w:bookmarkEnd w:id="22"/>
+    <w:bookmarkStart w:id="24" w:name="formal-check-pass-or-fail"/>
+    <w:p>
+      <w:pPr>
+        <w:pStyle w:val="Heading2"/>
+      </w:pPr>
+      <w:r>
+        <w:t xml:space="preserve">Formal check (pass or fail)</w:t>
+      </w:r>
+    </w:p>
+    <w:p>
+      <w:pPr>
+        <w:pStyle w:val="FirstParagraph"/>
+      </w:pPr>
+      <w:r>
+        <w:t xml:space="preserve">The instructors are not experts in your field. They check the form only. The statement passes when it meets all six criteria:</w:t>
+      </w:r>
+    </w:p>
+    <w:p>
+      <w:pPr>
+        <w:pStyle w:val="Compact"/>
+        <w:numPr>
+          <w:ilvl w:val="0"/>
+          <w:numId w:val="1012"/>
+        </w:numPr>
+      </w:pPr>
+      <w:r>
+        <w:rPr>
+          <w:b/>
+          <w:bCs/>
+        </w:rPr>
+        <w:t xml:space="preserve">Length:</w:t>
+      </w:r>
+      <w:r>
+        <w:t xml:space="preserve"> </w:t>
+      </w:r>
+      <w:r>
+        <w:t xml:space="preserve">1,200 to 1,500 words, without the bibliography and the peer note.</w:t>
+      </w:r>
+    </w:p>
+    <w:p>
+      <w:pPr>
+        <w:pStyle w:val="Compact"/>
+        <w:numPr>
+          <w:ilvl w:val="0"/>
+          <w:numId w:val="1012"/>
+        </w:numPr>
+      </w:pPr>
+      <w:r>
+        <w:rPr>
+          <w:b/>
+          <w:bCs/>
+        </w:rPr>
+        <w:t xml:space="preserve">Structure:</w:t>
+      </w:r>
+      <w:r>
+        <w:t xml:space="preserve"> </w:t>
+      </w:r>
+      <w:r>
+        <w:t xml:space="preserve">the seven headings, each with your own text.</w:t>
+      </w:r>
+    </w:p>
+    <w:p>
+      <w:pPr>
+        <w:pStyle w:val="Compact"/>
+        <w:numPr>
+          <w:ilvl w:val="0"/>
+          <w:numId w:val="1012"/>
+        </w:numPr>
+      </w:pPr>
+      <w:r>
+        <w:rPr>
+          <w:b/>
+          <w:bCs/>
+        </w:rPr>
+        <w:t xml:space="preserve">Sources:</w:t>
+      </w:r>
+      <w:r>
+        <w:t xml:space="preserve"> </w:t>
+      </w:r>
+      <w:r>
+        <w:t xml:space="preserve">a bibliography that lists every source that you cite.</w:t>
+      </w:r>
+    </w:p>
+    <w:p>
+      <w:pPr>
+        <w:pStyle w:val="Compact"/>
+        <w:numPr>
+          <w:ilvl w:val="0"/>
+          <w:numId w:val="1012"/>
+        </w:numPr>
+      </w:pPr>
+      <w:r>
+        <w:rPr>
+          <w:b/>
+          <w:bCs/>
+        </w:rPr>
+        <w:t xml:space="preserve">Follow-up action:</w:t>
+      </w:r>
+      <w:r>
+        <w:t xml:space="preserve"> </w:t>
+      </w:r>
+      <w:r>
+        <w:t xml:space="preserve">one action, with what, by when, and who must agree.</w:t>
+      </w:r>
+    </w:p>
+    <w:p>
+      <w:pPr>
+        <w:pStyle w:val="Compact"/>
+        <w:numPr>
+          <w:ilvl w:val="0"/>
+          <w:numId w:val="1012"/>
+        </w:numPr>
+      </w:pPr>
+      <w:r>
+        <w:rPr>
+          <w:b/>
+          <w:bCs/>
+        </w:rPr>
+        <w:t xml:space="preserve">Peer note:</w:t>
+      </w:r>
+      <w:r>
+        <w:t xml:space="preserve"> </w:t>
+      </w:r>
+      <w:r>
+        <w:t xml:space="preserve">the field and the role of at least one domain-expert peer, the date, the main feedback, and what you changed.</w:t>
+      </w:r>
+    </w:p>
+    <w:p>
+      <w:pPr>
+        <w:pStyle w:val="Compact"/>
+        <w:numPr>
+          <w:ilvl w:val="0"/>
+          <w:numId w:val="1012"/>
+        </w:numPr>
+      </w:pPr>
+      <w:r>
+        <w:rPr>
+          <w:b/>
+          <w:bCs/>
+        </w:rPr>
+        <w:t xml:space="preserve">Data protection:</w:t>
+      </w:r>
+      <w:r>
+        <w:t xml:space="preserve"> </w:t>
+      </w:r>
+      <w:r>
+        <w:t xml:space="preserve">no confidential, personal, or unpublished research data.</w:t>
       </w:r>
     </w:p>
     <w:p>
@@ -756,7 +1004,7 @@
       <w:r>
         <w:t xml:space="preserve"> </w:t>
       </w:r>
-      <w:hyperlink r:id="rId21">
+      <w:hyperlink r:id="rId23">
         <w:r>
           <w:rPr>
             <w:rStyle w:val="Hyperlink"/>
@@ -771,7 +1019,7 @@
         <w:t xml:space="preserve">· Stochastic Parrots and Beyond, Laura Wagner and Moritz Mähr.</w:t>
       </w:r>
     </w:p>
-    <w:bookmarkEnd w:id="22"/>
+    <w:bookmarkEnd w:id="24"/>
     <w:sectPr>
       <w:footnotePr>
         <w:numRestart w:val="eachSect"/>
@@ -1101,6 +1349,39 @@
     <w:abstractNumId w:val="991"/>
   </w:num>
   <w:num w:numId="1010">
+    <w:abstractNumId w:val="991"/>
+  </w:num>
+  <w:num w:numId="1011">
+    <w:abstractNumId w:val="99411"/>
+    <w:lvlOverride w:ilvl="0">
+      <w:startOverride w:val="1"/>
+    </w:lvlOverride>
+    <w:lvlOverride w:ilvl="1">
+      <w:startOverride w:val="1"/>
+    </w:lvlOverride>
+    <w:lvlOverride w:ilvl="2">
+      <w:startOverride w:val="1"/>
+    </w:lvlOverride>
+    <w:lvlOverride w:ilvl="3">
+      <w:startOverride w:val="1"/>
+    </w:lvlOverride>
+    <w:lvlOverride w:ilvl="4">
+      <w:startOverride w:val="1"/>
+    </w:lvlOverride>
+    <w:lvlOverride w:ilvl="5">
+      <w:startOverride w:val="1"/>
+    </w:lvlOverride>
+    <w:lvlOverride w:ilvl="6">
+      <w:startOverride w:val="1"/>
+    </w:lvlOverride>
+    <w:lvlOverride w:ilvl="7">
+      <w:startOverride w:val="1"/>
+    </w:lvlOverride>
+    <w:lvlOverride w:ilvl="8">
+      <w:startOverride w:val="1"/>
+    </w:lvlOverride>
+  </w:num>
+  <w:num w:numId="1012">
     <w:abstractNumId w:val="99411"/>
     <w:lvlOverride w:ilvl="0">
       <w:startOverride w:val="1"/>

</xml_diff>

<commit_message>
feat(submission): accept statements by email or GitHub issue form with opt-in publication
Participants submit the Use Statement by email to the course administration
(GRACE) or through a new public issue form. The form asks for no real name and
no peer name. It requires a declaration that the issue is public and holds no
protected data. Publication on the course site is opt-in. The template and the
formal check now include a publication declaration.

AGENTS.md and the reuse guide allow this one exception to the privacy rule.
TODO.md lists the label and the approval of the channels.

Co-Authored-By: Claude Opus 5.5 <noreply@anthropic.com>
</commit_message>
<xml_diff>
--- a/assets/handouts/use-statement-template.docx
+++ b/assets/handouts/use-statement-template.docx
@@ -127,7 +127,7 @@
               <w:spacing w:before="16" w:after="16"/>
             </w:pPr>
             <w:r>
-              <w:t xml:space="preserve">This task is a proposal. The instructors and the Graduate Center (GRACE) confirm the task, the rules, the submission channel, and the deadline for each edition. Do not submit through GitHub. Do not include confidential or personal research data.</w:t>
+              <w:t xml:space="preserve">This task is a proposal. The instructors and the Graduate Center (GRACE) confirm the task, the rules, the submission channels, and the deadline for each edition. Do not include confidential or personal research data.</w:t>
             </w:r>
           </w:p>
           <w:p/>
@@ -197,7 +197,23 @@
         <w:t xml:space="preserve"> </w:t>
       </w:r>
       <w:r>
-        <w:t xml:space="preserve">a formal check, pass or fail, with the six criteria at the end.</w:t>
+        <w:t xml:space="preserve">a formal check, pass or fail, with the seven criteria at the end.</w:t>
+      </w:r>
+      <w:r>
+        <w:t xml:space="preserve"> </w:t>
+      </w:r>
+      <w:r>
+        <w:rPr>
+          <w:b/>
+          <w:bCs/>
+        </w:rPr>
+        <w:t xml:space="preserve">Submission:</w:t>
+      </w:r>
+      <w:r>
+        <w:t xml:space="preserve"> </w:t>
+      </w:r>
+      <w:r>
+        <w:t xml:space="preserve">by email to the course administration (GRACE), or through the Use Statement issue form on GitHub. A GitHub issue is public.</w:t>
       </w:r>
     </w:p>
     <w:p>
@@ -710,12 +726,85 @@
       </w:r>
     </w:p>
     <w:bookmarkEnd w:id="21"/>
-    <w:bookmarkStart w:id="22" w:name="questions-for-your-peer"/>
+    <w:bookmarkStart w:id="22" w:name="publication"/>
     <w:p>
       <w:pPr>
         <w:pStyle w:val="Heading2"/>
       </w:pPr>
       <w:r>
+        <w:t xml:space="preserve">Publication</w:t>
+      </w:r>
+    </w:p>
+    <w:p>
+      <w:pPr>
+        <w:pStyle w:val="FirstParagraph"/>
+      </w:pPr>
+      <w:r>
+        <w:t xml:space="preserve">The instructors publish a statement on the course site only when its author agrees. Write one answer:</w:t>
+      </w:r>
+      <w:r>
+        <w:t xml:space="preserve"> </w:t>
+      </w:r>
+      <w:r>
+        <w:rPr>
+          <w:b/>
+          <w:bCs/>
+        </w:rPr>
+        <w:t xml:space="preserve">no</w:t>
+      </w:r>
+      <w:r>
+        <w:t xml:space="preserve">,</w:t>
+      </w:r>
+      <w:r>
+        <w:t xml:space="preserve"> </w:t>
+      </w:r>
+      <w:r>
+        <w:rPr>
+          <w:b/>
+          <w:bCs/>
+        </w:rPr>
+        <w:t xml:space="preserve">yes, with my name</w:t>
+      </w:r>
+      <w:r>
+        <w:t xml:space="preserve">, or</w:t>
+      </w:r>
+      <w:r>
+        <w:t xml:space="preserve"> </w:t>
+      </w:r>
+      <w:r>
+        <w:rPr>
+          <w:b/>
+          <w:bCs/>
+        </w:rPr>
+        <w:t xml:space="preserve">yes, anonymously</w:t>
+      </w:r>
+      <w:r>
+        <w:t xml:space="preserve">. Without an answer, the statement stays unpublished.</w:t>
+      </w:r>
+    </w:p>
+    <w:p>
+      <w:pPr>
+        <w:pStyle w:val="Compact"/>
+        <w:numPr>
+          <w:ilvl w:val="0"/>
+          <w:numId w:val="1011"/>
+        </w:numPr>
+      </w:pPr>
+      <w:r>
+        <w:rPr>
+          <w:b/>
+          <w:bCs/>
+        </w:rPr>
+        <w:t xml:space="preserve">My answer:</w:t>
+      </w:r>
+    </w:p>
+    <w:bookmarkEnd w:id="22"/>
+    <w:bookmarkStart w:id="23" w:name="questions-for-your-peer"/>
+    <w:p>
+      <w:pPr>
+        <w:pStyle w:val="Heading2"/>
+      </w:pPr>
+      <w:r>
         <w:t xml:space="preserve">Questions for your peer</w:t>
       </w:r>
     </w:p>
@@ -732,7 +821,7 @@
         <w:pStyle w:val="Compact"/>
         <w:numPr>
           <w:ilvl w:val="0"/>
-          <w:numId w:val="1011"/>
+          <w:numId w:val="1012"/>
         </w:numPr>
       </w:pPr>
       <w:r>
@@ -754,7 +843,7 @@
         <w:pStyle w:val="Compact"/>
         <w:numPr>
           <w:ilvl w:val="0"/>
-          <w:numId w:val="1011"/>
+          <w:numId w:val="1012"/>
         </w:numPr>
       </w:pPr>
       <w:r>
@@ -776,7 +865,7 @@
         <w:pStyle w:val="Compact"/>
         <w:numPr>
           <w:ilvl w:val="0"/>
-          <w:numId w:val="1011"/>
+          <w:numId w:val="1012"/>
         </w:numPr>
       </w:pPr>
       <w:r>
@@ -798,7 +887,7 @@
         <w:pStyle w:val="Compact"/>
         <w:numPr>
           <w:ilvl w:val="0"/>
-          <w:numId w:val="1011"/>
+          <w:numId w:val="1012"/>
         </w:numPr>
       </w:pPr>
       <w:r>
@@ -820,7 +909,7 @@
         <w:pStyle w:val="Compact"/>
         <w:numPr>
           <w:ilvl w:val="0"/>
-          <w:numId w:val="1011"/>
+          <w:numId w:val="1012"/>
         </w:numPr>
       </w:pPr>
       <w:r>
@@ -837,8 +926,8 @@
         <w:t xml:space="preserve">reaches a decision that follows from the analysis, names a check whose result would change it, and states its limits.</w:t>
       </w:r>
     </w:p>
-    <w:bookmarkEnd w:id="22"/>
-    <w:bookmarkStart w:id="24" w:name="formal-check-pass-or-fail"/>
+    <w:bookmarkEnd w:id="23"/>
+    <w:bookmarkStart w:id="25" w:name="formal-check-pass-or-fail"/>
     <w:p>
       <w:pPr>
         <w:pStyle w:val="Heading2"/>
@@ -852,15 +941,15 @@
         <w:pStyle w:val="FirstParagraph"/>
       </w:pPr>
       <w:r>
-        <w:t xml:space="preserve">The instructors are not experts in your field. They check the form only. The statement passes when it meets all six criteria:</w:t>
-      </w:r>
-    </w:p>
-    <w:p>
-      <w:pPr>
-        <w:pStyle w:val="Compact"/>
-        <w:numPr>
-          <w:ilvl w:val="0"/>
-          <w:numId w:val="1012"/>
+        <w:t xml:space="preserve">The instructors are not experts in your field. They check the form only. The statement passes when it meets all seven criteria:</w:t>
+      </w:r>
+    </w:p>
+    <w:p>
+      <w:pPr>
+        <w:pStyle w:val="Compact"/>
+        <w:numPr>
+          <w:ilvl w:val="0"/>
+          <w:numId w:val="1013"/>
         </w:numPr>
       </w:pPr>
       <w:r>
@@ -882,7 +971,7 @@
         <w:pStyle w:val="Compact"/>
         <w:numPr>
           <w:ilvl w:val="0"/>
-          <w:numId w:val="1012"/>
+          <w:numId w:val="1013"/>
         </w:numPr>
       </w:pPr>
       <w:r>
@@ -904,7 +993,7 @@
         <w:pStyle w:val="Compact"/>
         <w:numPr>
           <w:ilvl w:val="0"/>
-          <w:numId w:val="1012"/>
+          <w:numId w:val="1013"/>
         </w:numPr>
       </w:pPr>
       <w:r>
@@ -926,7 +1015,7 @@
         <w:pStyle w:val="Compact"/>
         <w:numPr>
           <w:ilvl w:val="0"/>
-          <w:numId w:val="1012"/>
+          <w:numId w:val="1013"/>
         </w:numPr>
       </w:pPr>
       <w:r>
@@ -948,7 +1037,7 @@
         <w:pStyle w:val="Compact"/>
         <w:numPr>
           <w:ilvl w:val="0"/>
-          <w:numId w:val="1012"/>
+          <w:numId w:val="1013"/>
         </w:numPr>
       </w:pPr>
       <w:r>
@@ -970,7 +1059,38 @@
         <w:pStyle w:val="Compact"/>
         <w:numPr>
           <w:ilvl w:val="0"/>
-          <w:numId w:val="1012"/>
+          <w:numId w:val="1013"/>
+        </w:numPr>
+      </w:pPr>
+      <w:r>
+        <w:rPr>
+          <w:b/>
+          <w:bCs/>
+        </w:rPr>
+        <w:t xml:space="preserve">Publication:</w:t>
+      </w:r>
+      <w:r>
+        <w:t xml:space="preserve"> </w:t>
+      </w:r>
+      <w:r>
+        <w:t xml:space="preserve">an answer in the section</w:t>
+      </w:r>
+      <w:r>
+        <w:t xml:space="preserve"> </w:t>
+      </w:r>
+      <w:r>
+        <w:t xml:space="preserve">“Publication”</w:t>
+      </w:r>
+      <w:r>
+        <w:t xml:space="preserve">.</w:t>
+      </w:r>
+    </w:p>
+    <w:p>
+      <w:pPr>
+        <w:pStyle w:val="Compact"/>
+        <w:numPr>
+          <w:ilvl w:val="0"/>
+          <w:numId w:val="1013"/>
         </w:numPr>
       </w:pPr>
       <w:r>
@@ -1004,7 +1124,7 @@
       <w:r>
         <w:t xml:space="preserve"> </w:t>
       </w:r>
-      <w:hyperlink r:id="rId23">
+      <w:hyperlink r:id="rId24">
         <w:r>
           <w:rPr>
             <w:rStyle w:val="Hyperlink"/>
@@ -1019,7 +1139,7 @@
         <w:t xml:space="preserve">· Stochastic Parrots and Beyond, Laura Wagner and Moritz Mähr.</w:t>
       </w:r>
     </w:p>
-    <w:bookmarkEnd w:id="24"/>
+    <w:bookmarkEnd w:id="25"/>
     <w:sectPr>
       <w:footnotePr>
         <w:numRestart w:val="eachSect"/>
@@ -1352,6 +1472,9 @@
     <w:abstractNumId w:val="991"/>
   </w:num>
   <w:num w:numId="1011">
+    <w:abstractNumId w:val="991"/>
+  </w:num>
+  <w:num w:numId="1012">
     <w:abstractNumId w:val="99411"/>
     <w:lvlOverride w:ilvl="0">
       <w:startOverride w:val="1"/>
@@ -1381,7 +1504,7 @@
       <w:startOverride w:val="1"/>
     </w:lvlOverride>
   </w:num>
-  <w:num w:numId="1012">
+  <w:num w:numId="1013">
     <w:abstractNumId w:val="99411"/>
     <w:lvlOverride w:ilvl="0">
       <w:startOverride w:val="1"/>

</xml_diff>

<commit_message>
feat(handouts): add Word versions of the fillable worksheets
No handout could be filled in on a laptop: the PDFs have no form fields, and
only the Use Statement template had a Word version. The four lens worksheets,
the shared risk worksheet, the Ecocycle sheet, and the action plan now also
build to Word. The handout pages and the resources page link the Word files.

The default reference document of Pandoc draws no table borders.
scripts/build_reference_docx.py builds contents/handouts/_reference.docx with
visible cell borders, and the handout metadata uses it.

The lens pages and decks now say "on paper or on a laptop".

Co-Authored-By: Claude Opus 5.5 <noreply@anthropic.com>
</commit_message>
<xml_diff>
--- a/assets/handouts/use-statement-template.docx
+++ b/assets/handouts/use-statement-template.docx
@@ -2078,6 +2078,14 @@
     <w:qFormat/>
     <w:tblPr>
       <w:tblInd w:type="dxa" w:w="0"/>
+      <w:tblBorders>
+        <w:top w:color="808080" w:space="0" w:sz="4" w:val="single"/>
+        <w:left w:color="808080" w:space="0" w:sz="4" w:val="single"/>
+        <w:bottom w:color="808080" w:space="0" w:sz="4" w:val="single"/>
+        <w:right w:color="808080" w:space="0" w:sz="4" w:val="single"/>
+        <w:insideH w:color="808080" w:space="0" w:sz="4" w:val="single"/>
+        <w:insideV w:color="808080" w:space="0" w:sz="4" w:val="single"/>
+      </w:tblBorders>
       <w:tblCellMar>
         <w:top w:type="dxa" w:w="0"/>
         <w:left w:type="dxa" w:w="108"/>
@@ -2085,6 +2093,9 @@
         <w:right w:type="dxa" w:w="108"/>
       </w:tblCellMar>
     </w:tblPr>
+    <w:trPr>
+      <w:trHeight w:hRule="atLeast" w:val="510"/>
+    </w:trPr>
     <w:tblStylePr w:type="firstRow">
       <w:tcPr>
         <w:tcBorders>

</xml_diff>

<commit_message>
docs: confirm the timetable, the preparation plan, and the follow-up rules
The instructors approved the timetable, the eight-hour preparation plan, the
Use Statement with its formal check and peer discussion, and the two
submission channels. Remove the "Proposed" labels and callouts, and set
`detailed_program_status: approved` for HS 2026. The deadline stays "To be
confirmed" until GRACE confirms it.

TODO.md records the approvals, the merge of PR #1, and the restriction of the
github-pages environment to main.

Co-Authored-By: Claude Opus 5.5 <noreply@anthropic.com>
</commit_message>
<xml_diff>
--- a/assets/handouts/use-statement-template.docx
+++ b/assets/handouts/use-statement-template.docx
@@ -15,7 +15,7 @@
         <w:pStyle w:val="Subtitle"/>
       </w:pPr>
       <w:r>
-        <w:t xml:space="preserve">Stochastic Parrots and Beyond · follow-up task (proposed)</w:t>
+        <w:t xml:space="preserve">Stochastic Parrots and Beyond · follow-up task</w:t>
       </w:r>
     </w:p>
     <w:tbl>
@@ -23,10 +23,10 @@
         <w:tblStyle w:val="Table"/>
         <w:tblLook w:firstRow="0" w:lastRow="0" w:firstColumn="0" w:lastColumn="0" w:noHBand="0" w:noVBand="0" w:val="0000"/>
         <w:tblBorders>
-          <w:top w:val="single" w:sz="4" w:space="0" w:color="EB9113"/>
-          <w:left w:val="single" w:sz="24" w:space="0" w:color="EB9113"/>
-          <w:bottom w:val="single" w:sz="4" w:space="0" w:color="EB9113"/>
-          <w:right w:val="single" w:sz="4" w:space="0" w:color="EB9113"/>
+          <w:top w:val="single" w:sz="4" w:space="0" w:color="CC1914"/>
+          <w:left w:val="single" w:sz="24" w:space="0" w:color="CC1914"/>
+          <w:bottom w:val="single" w:sz="4" w:space="0" w:color="CC1914"/>
+          <w:right w:val="single" w:sz="4" w:space="0" w:color="CC1914"/>
         </w:tblBorders>
         <w:tblCellMar>
           <w:left w:w="144" w:type="dxa"/>
@@ -40,7 +40,7 @@
         </w:trPr>
         <w:tc>
           <w:tcPr>
-            <w:shd w:color="auto" w:fill="fcefdc" w:val="clear"/>
+            <w:shd w:color="auto" w:fill="f7dddc" w:val="clear"/>
             <w:tcMar>
               <w:top w:w="92" w:type="dxa"/>
               <w:bottom w:w="92" w:type="dxa"/>
@@ -64,7 +64,7 @@
                     <a:graphicData uri="http://schemas.openxmlformats.org/drawingml/2006/picture">
                       <pic:pic>
                         <pic:nvPicPr>
-                          <pic:cNvPr descr="/Applications/quarto/share/formats/docx/warning.png" id="11" name="Picture"/>
+                          <pic:cNvPr descr="/Applications/quarto/share/formats/docx/important.png" id="11" name="Picture"/>
                           <pic:cNvPicPr>
                             <a:picLocks noChangeArrowheads="1" noChangeAspect="1"/>
                           </pic:cNvPicPr>
@@ -103,7 +103,7 @@
               <w:t xml:space="preserve"> </w:t>
             </w:r>
             <w:r>
-              <w:t xml:space="preserve">Proposed task — check the edition page</w:t>
+              <w:t xml:space="preserve">Check the edition page</w:t>
             </w:r>
           </w:p>
         </w:tc>
@@ -127,7 +127,7 @@
               <w:spacing w:before="16" w:after="16"/>
             </w:pPr>
             <w:r>
-              <w:t xml:space="preserve">This task is a proposal. The instructors and the Graduate Center (GRACE) confirm the task, the rules, the submission channels, and the deadline for each edition. Do not include confidential or personal research data.</w:t>
+              <w:t xml:space="preserve">Your edition page gives the deadline and the email address for the submission. Do not include confidential or personal research data.</w:t>
             </w:r>
           </w:p>
           <w:p/>

</xml_diff>